<commit_message>
Python script for analyzing Wireshark captured HTTP file and decoding Elements. Password recovery by guessing and encoding passwords.
</commit_message>
<xml_diff>
--- a/Computer Networks/Advanced/Lab/Assignment_4/22CS02002_SohamChakraborty_Assignment4.docx
+++ b/Computer Networks/Advanced/Lab/Assignment_4/22CS02002_SohamChakraborty_Assignment4.docx
@@ -1030,23 +1030,7 @@
           <w:sz w:val="28"/>
           <w:szCs w:val="28"/>
         </w:rPr>
-        <w:t>b4:45:06:7a:</w:t>
-      </w:r>
-      <w:proofErr w:type="gramStart"/>
-      <w:r>
-        <w:rPr>
-          <w:sz w:val="28"/>
-          <w:szCs w:val="28"/>
-        </w:rPr>
-        <w:t>81:a</w:t>
-      </w:r>
-      <w:proofErr w:type="gramEnd"/>
-      <w:r>
-        <w:rPr>
-          <w:sz w:val="28"/>
-          <w:szCs w:val="28"/>
-        </w:rPr>
-        <w:t>7</w:t>
+        <w:t>b4:45:06:7a:81:a7</w:t>
       </w:r>
     </w:p>
     <w:p>
@@ -1505,17 +1489,7 @@
           <w:sz w:val="28"/>
           <w:szCs w:val="28"/>
         </w:rPr>
-        <w:t>Ans – 1</w:t>
-      </w:r>
-      <w:proofErr w:type="gramStart"/>
-      <w:r>
-        <w:rPr>
-          <w:b/>
-          <w:bCs/>
-          <w:sz w:val="28"/>
-          <w:szCs w:val="28"/>
-        </w:rPr>
-        <w:t xml:space="preserve">)  </w:t>
+        <w:t xml:space="preserve">Ans – 1)  </w:t>
       </w:r>
       <w:r>
         <w:rPr>
@@ -1524,7 +1498,6 @@
         </w:rPr>
         <w:t>Filters</w:t>
       </w:r>
-      <w:proofErr w:type="gramEnd"/>
     </w:p>
     <w:p>
       <w:pPr>
@@ -1891,25 +1864,7 @@
           <w:sz w:val="28"/>
           <w:szCs w:val="28"/>
         </w:rPr>
-        <w:t xml:space="preserve">Ans – </w:t>
-      </w:r>
-      <w:r>
-        <w:rPr>
-          <w:b/>
-          <w:bCs/>
-          <w:sz w:val="28"/>
-          <w:szCs w:val="28"/>
-        </w:rPr>
-        <w:t>2</w:t>
-      </w:r>
-      <w:r>
-        <w:rPr>
-          <w:b/>
-          <w:bCs/>
-          <w:sz w:val="28"/>
-          <w:szCs w:val="28"/>
-        </w:rPr>
-        <w:t xml:space="preserve">)  </w:t>
+        <w:t xml:space="preserve">Ans – 2)  </w:t>
       </w:r>
     </w:p>
     <w:p>
@@ -1940,29 +1895,23 @@
           <w:sz w:val="28"/>
           <w:szCs w:val="28"/>
         </w:rPr>
-        <w:t>TCP</w:t>
-      </w:r>
-      <w:r>
-        <w:rPr>
-          <w:sz w:val="28"/>
-          <w:szCs w:val="28"/>
-        </w:rPr>
-        <w:t xml:space="preserve"> Connection using Follow [SYN] TCP stream.</w:t>
-      </w:r>
-    </w:p>
-    <w:p>
-      <w:pPr>
-        <w:rPr>
-          <w:b/>
-          <w:bCs/>
-          <w:sz w:val="48"/>
-          <w:szCs w:val="48"/>
-        </w:rPr>
-      </w:pPr>
-      <w:r>
-        <w:rPr>
-          <w:b/>
-          <w:bCs/>
+        <w:t>TCP Connection using Follow [SYN] TCP stream.</w:t>
+      </w:r>
+    </w:p>
+    <w:p>
+      <w:pPr>
+        <w:rPr>
+          <w:b/>
+          <w:bCs/>
+          <w:sz w:val="48"/>
+          <w:szCs w:val="48"/>
+        </w:rPr>
+      </w:pPr>
+      <w:r>
+        <w:rPr>
+          <w:b/>
+          <w:bCs/>
+          <w:noProof/>
           <w:sz w:val="48"/>
           <w:szCs w:val="48"/>
         </w:rPr>
@@ -2118,38 +2067,23 @@
           <w:sz w:val="28"/>
           <w:szCs w:val="28"/>
         </w:rPr>
-        <w:t xml:space="preserve">UDP – </w:t>
-      </w:r>
-      <w:proofErr w:type="spellStart"/>
-      <w:r>
-        <w:rPr>
-          <w:sz w:val="28"/>
-          <w:szCs w:val="28"/>
-        </w:rPr>
-        <w:t>dns</w:t>
-      </w:r>
-      <w:proofErr w:type="spellEnd"/>
-      <w:r>
-        <w:rPr>
-          <w:sz w:val="28"/>
-          <w:szCs w:val="28"/>
-        </w:rPr>
-        <w:t xml:space="preserve"> communication.</w:t>
-      </w:r>
-    </w:p>
-    <w:p>
-      <w:pPr>
-        <w:rPr>
-          <w:b/>
-          <w:bCs/>
-          <w:sz w:val="48"/>
-          <w:szCs w:val="48"/>
-        </w:rPr>
-      </w:pPr>
-      <w:r>
-        <w:rPr>
-          <w:b/>
-          <w:bCs/>
+        <w:t>UDP – dns communication.</w:t>
+      </w:r>
+    </w:p>
+    <w:p>
+      <w:pPr>
+        <w:rPr>
+          <w:b/>
+          <w:bCs/>
+          <w:sz w:val="48"/>
+          <w:szCs w:val="48"/>
+        </w:rPr>
+      </w:pPr>
+      <w:r>
+        <w:rPr>
+          <w:b/>
+          <w:bCs/>
+          <w:noProof/>
           <w:sz w:val="48"/>
           <w:szCs w:val="48"/>
         </w:rPr>
@@ -2262,41 +2196,14 @@
           <w:sz w:val="28"/>
           <w:szCs w:val="28"/>
         </w:rPr>
-        <w:t xml:space="preserve">Ans – </w:t>
-      </w:r>
-      <w:r>
-        <w:rPr>
-          <w:b/>
-          <w:bCs/>
-          <w:sz w:val="28"/>
-          <w:szCs w:val="28"/>
-        </w:rPr>
-        <w:t>3</w:t>
-      </w:r>
-      <w:proofErr w:type="gramStart"/>
-      <w:r>
-        <w:rPr>
-          <w:b/>
-          <w:bCs/>
-          <w:sz w:val="28"/>
-          <w:szCs w:val="28"/>
-        </w:rPr>
-        <w:t xml:space="preserve">)  </w:t>
-      </w:r>
-      <w:r>
-        <w:rPr>
-          <w:sz w:val="28"/>
-          <w:szCs w:val="28"/>
-        </w:rPr>
-        <w:t>In</w:t>
-      </w:r>
-      <w:proofErr w:type="gramEnd"/>
-      <w:r>
-        <w:rPr>
-          <w:sz w:val="28"/>
-          <w:szCs w:val="28"/>
-        </w:rPr>
-        <w:t xml:space="preserve"> TCP </w:t>
+        <w:t xml:space="preserve">Ans – 3)  </w:t>
+      </w:r>
+      <w:r>
+        <w:rPr>
+          <w:sz w:val="28"/>
+          <w:szCs w:val="28"/>
+        </w:rPr>
+        <w:t xml:space="preserve">In TCP </w:t>
       </w:r>
       <w:r>
         <w:rPr>
@@ -2310,23 +2217,7 @@
           <w:sz w:val="28"/>
           <w:szCs w:val="28"/>
         </w:rPr>
-        <w:t xml:space="preserve"> packets of types [SYN</w:t>
-      </w:r>
-      <w:proofErr w:type="gramStart"/>
-      <w:r>
-        <w:rPr>
-          <w:sz w:val="28"/>
-          <w:szCs w:val="28"/>
-        </w:rPr>
-        <w:t>] ,</w:t>
-      </w:r>
-      <w:proofErr w:type="gramEnd"/>
-      <w:r>
-        <w:rPr>
-          <w:sz w:val="28"/>
-          <w:szCs w:val="28"/>
-        </w:rPr>
-        <w:t xml:space="preserve"> [SYN, ACK] and [ACK]</w:t>
+        <w:t xml:space="preserve"> packets of types [SYN] , [SYN, ACK] and [ACK]</w:t>
       </w:r>
       <w:r>
         <w:rPr>
@@ -2538,23 +2429,7 @@
           <w:sz w:val="28"/>
           <w:szCs w:val="28"/>
         </w:rPr>
-        <w:t xml:space="preserve">has some </w:t>
-      </w:r>
-      <w:proofErr w:type="gramStart"/>
-      <w:r>
-        <w:rPr>
-          <w:sz w:val="28"/>
-          <w:szCs w:val="28"/>
-        </w:rPr>
-        <w:t>server side</w:t>
-      </w:r>
-      <w:proofErr w:type="gramEnd"/>
-      <w:r>
-        <w:rPr>
-          <w:sz w:val="28"/>
-          <w:szCs w:val="28"/>
-        </w:rPr>
-        <w:t xml:space="preserve"> error so I will have to work only based on </w:t>
+        <w:t xml:space="preserve">has some server side error so I will have to work only based on </w:t>
       </w:r>
       <w:r>
         <w:rPr>
@@ -2832,21 +2707,7 @@
           <w:sz w:val="28"/>
           <w:szCs w:val="28"/>
         </w:rPr>
-        <w:t xml:space="preserve">HTTP </w:t>
-      </w:r>
-      <w:r>
-        <w:rPr>
-          <w:sz w:val="28"/>
-          <w:szCs w:val="28"/>
-        </w:rPr>
-        <w:t>Response</w:t>
-      </w:r>
-      <w:r>
-        <w:rPr>
-          <w:sz w:val="28"/>
-          <w:szCs w:val="28"/>
-        </w:rPr>
-        <w:t xml:space="preserve"> packet </w:t>
+        <w:t xml:space="preserve">HTTP Response packet </w:t>
       </w:r>
       <w:r>
         <w:rPr>
@@ -2950,25 +2811,7 @@
           <w:szCs w:val="28"/>
         </w:rPr>
         <w:lastRenderedPageBreak/>
-        <w:t xml:space="preserve">Ans – </w:t>
-      </w:r>
-      <w:r>
-        <w:rPr>
-          <w:b/>
-          <w:bCs/>
-          <w:sz w:val="28"/>
-          <w:szCs w:val="28"/>
-        </w:rPr>
-        <w:t>2</w:t>
-      </w:r>
-      <w:r>
-        <w:rPr>
-          <w:b/>
-          <w:bCs/>
-          <w:sz w:val="28"/>
-          <w:szCs w:val="28"/>
-        </w:rPr>
-        <w:t xml:space="preserve">) </w:t>
+        <w:t xml:space="preserve">Ans – 2) </w:t>
       </w:r>
     </w:p>
     <w:p>
@@ -3165,127 +3008,53 @@
     <w:p>
       <w:pPr>
         <w:rPr>
-          <w:rFonts w:ascii="Calibri Light" w:hAnsi="Calibri Light" w:cs="Calibri Light"/>
-          <w:sz w:val="28"/>
-          <w:szCs w:val="28"/>
-        </w:rPr>
-      </w:pPr>
-      <w:r>
-        <w:rPr>
-          <w:rFonts w:ascii="Calibri Light" w:hAnsi="Calibri Light" w:cs="Calibri Light"/>
-          <w:sz w:val="28"/>
-          <w:szCs w:val="28"/>
-        </w:rPr>
-        <w:t>Given website (</w:t>
-      </w:r>
-      <w:r>
-        <w:rPr>
-          <w:rFonts w:ascii="Calibri Light" w:hAnsi="Calibri Light" w:cs="Calibri Light"/>
-          <w:sz w:val="28"/>
-          <w:szCs w:val="28"/>
-        </w:rPr>
-        <w:t>http://testaspnet.vulnweb.com/login.aspx</w:t>
-      </w:r>
-      <w:r>
-        <w:rPr>
-          <w:rFonts w:ascii="Calibri Light" w:hAnsi="Calibri Light" w:cs="Calibri Light"/>
-          <w:sz w:val="28"/>
-          <w:szCs w:val="28"/>
-        </w:rPr>
-        <w:t>) is not working.</w:t>
-      </w:r>
-    </w:p>
-    <w:p>
-      <w:pPr>
-        <w:rPr>
-          <w:rFonts w:ascii="Calibri Light" w:hAnsi="Calibri Light" w:cs="Calibri Light"/>
-          <w:sz w:val="28"/>
-          <w:szCs w:val="28"/>
-        </w:rPr>
-      </w:pPr>
-      <w:r>
-        <w:rPr>
-          <w:rFonts w:ascii="Calibri Light" w:hAnsi="Calibri Light" w:cs="Calibri Light"/>
-          <w:sz w:val="28"/>
-          <w:szCs w:val="28"/>
-        </w:rPr>
-        <w:t xml:space="preserve">I tried another </w:t>
-      </w:r>
-      <w:proofErr w:type="gramStart"/>
-      <w:r>
-        <w:rPr>
-          <w:rFonts w:ascii="Calibri Light" w:hAnsi="Calibri Light" w:cs="Calibri Light"/>
-          <w:sz w:val="28"/>
-          <w:szCs w:val="28"/>
-        </w:rPr>
-        <w:t>website  -</w:t>
-      </w:r>
-      <w:proofErr w:type="gramEnd"/>
-      <w:r>
-        <w:rPr>
-          <w:rFonts w:ascii="Calibri Light" w:hAnsi="Calibri Light" w:cs="Calibri Light"/>
-          <w:sz w:val="28"/>
-          <w:szCs w:val="28"/>
-        </w:rPr>
-        <w:t xml:space="preserve"> </w:t>
-      </w:r>
-      <w:hyperlink r:id="rId23" w:history="1">
-        <w:r>
-          <w:rPr>
-            <w:rStyle w:val="Hyperlink"/>
-            <w:rFonts w:ascii="Calibri Light" w:hAnsi="Calibri Light" w:cs="Calibri Light"/>
-            <w:sz w:val="28"/>
-            <w:szCs w:val="28"/>
-          </w:rPr>
-          <w:t>http://testphp.vulnweb.com/login.php</w:t>
-        </w:r>
-      </w:hyperlink>
-      <w:r>
-        <w:rPr>
-          <w:rFonts w:ascii="Calibri Light" w:hAnsi="Calibri Light" w:cs="Calibri Light"/>
-          <w:sz w:val="28"/>
-          <w:szCs w:val="28"/>
-        </w:rPr>
-        <w:t>.</w:t>
-      </w:r>
-    </w:p>
-    <w:p>
-      <w:pPr>
-        <w:rPr>
-          <w:rFonts w:ascii="Calibri Light" w:hAnsi="Calibri Light" w:cs="Calibri Light"/>
-          <w:sz w:val="28"/>
-          <w:szCs w:val="28"/>
-        </w:rPr>
-      </w:pPr>
-      <w:r>
-        <w:rPr>
-          <w:rFonts w:ascii="Calibri Light" w:hAnsi="Calibri Light" w:cs="Calibri Light"/>
-          <w:sz w:val="28"/>
-          <w:szCs w:val="28"/>
-        </w:rPr>
-        <w:t xml:space="preserve">But this was also not working. So further writing a Script and POST login credentials was not possible. </w:t>
-      </w:r>
-    </w:p>
-    <w:p>
-      <w:r>
-        <w:rPr>
-          <w:rFonts w:ascii="Calibri Light" w:hAnsi="Calibri Light" w:cs="Calibri Light"/>
-          <w:sz w:val="28"/>
-          <w:szCs w:val="28"/>
+          <w:sz w:val="28"/>
+          <w:szCs w:val="28"/>
+        </w:rPr>
+      </w:pPr>
+      <w:r>
+        <w:rPr>
+          <w:b/>
+          <w:bCs/>
+          <w:sz w:val="28"/>
+          <w:szCs w:val="28"/>
+        </w:rPr>
+        <w:t xml:space="preserve">Ans – 1)  </w:t>
+      </w:r>
+      <w:r>
+        <w:rPr>
+          <w:sz w:val="28"/>
+          <w:szCs w:val="28"/>
+        </w:rPr>
+        <w:t>Filters</w:t>
+      </w:r>
+    </w:p>
+    <w:p>
+      <w:pPr>
+        <w:rPr>
+          <w:b/>
+          <w:bCs/>
+          <w:sz w:val="28"/>
+          <w:szCs w:val="28"/>
+        </w:rPr>
+      </w:pPr>
+      <w:r>
+        <w:rPr>
+          <w:noProof/>
         </w:rPr>
         <w:drawing>
-          <wp:anchor distT="0" distB="0" distL="114300" distR="114300" simplePos="0" relativeHeight="251685888" behindDoc="0" locked="0" layoutInCell="1" allowOverlap="1" wp14:anchorId="7639ACF1" wp14:editId="221FDBBE">
+          <wp:anchor distT="0" distB="0" distL="114300" distR="114300" simplePos="0" relativeHeight="251685888" behindDoc="0" locked="0" layoutInCell="1" allowOverlap="1" wp14:anchorId="27F3FB8B" wp14:editId="6AE091E7">
             <wp:simplePos x="0" y="0"/>
-            <wp:positionH relativeFrom="margin">
-              <wp:align>left</wp:align>
+            <wp:positionH relativeFrom="column">
+              <wp:posOffset>242570</wp:posOffset>
             </wp:positionH>
             <wp:positionV relativeFrom="paragraph">
-              <wp:posOffset>409382</wp:posOffset>
+              <wp:posOffset>351806</wp:posOffset>
             </wp:positionV>
-            <wp:extent cx="5731510" cy="2876550"/>
-            <wp:effectExtent l="0" t="0" r="2540" b="0"/>
+            <wp:extent cx="5731510" cy="2684780"/>
+            <wp:effectExtent l="0" t="0" r="2540" b="1270"/>
             <wp:wrapNone/>
-            <wp:docPr id="1786707560" name="Picture 1"/>
+            <wp:docPr id="90579783" name="Picture 1"/>
             <wp:cNvGraphicFramePr>
               <a:graphicFrameLocks xmlns:a="http://schemas.openxmlformats.org/drawingml/2006/main" noChangeAspect="1"/>
             </wp:cNvGraphicFramePr>
@@ -3293,11 +3062,11 @@
               <a:graphicData uri="http://schemas.openxmlformats.org/drawingml/2006/picture">
                 <pic:pic xmlns:pic="http://schemas.openxmlformats.org/drawingml/2006/picture">
                   <pic:nvPicPr>
-                    <pic:cNvPr id="1786707560" name=""/>
+                    <pic:cNvPr id="90579783" name=""/>
                     <pic:cNvPicPr/>
                   </pic:nvPicPr>
                   <pic:blipFill>
-                    <a:blip r:embed="rId24"/>
+                    <a:blip r:embed="rId23"/>
                     <a:stretch>
                       <a:fillRect/>
                     </a:stretch>
@@ -3305,7 +3074,7 @@
                   <pic:spPr>
                     <a:xfrm>
                       <a:off x="0" y="0"/>
-                      <a:ext cx="5731510" cy="2876550"/>
+                      <a:ext cx="5731510" cy="2684780"/>
                     </a:xfrm>
                     <a:prstGeom prst="rect">
                       <a:avLst/>
@@ -3319,35 +3088,89 @@
       </w:r>
       <w:r>
         <w:rPr>
-          <w:rFonts w:ascii="Calibri Light" w:hAnsi="Calibri Light" w:cs="Calibri Light"/>
-          <w:sz w:val="28"/>
-          <w:szCs w:val="28"/>
-        </w:rPr>
-        <w:t xml:space="preserve">Error Screenshot of </w:t>
-      </w:r>
-      <w:proofErr w:type="gramStart"/>
-      <w:r>
-        <w:rPr>
-          <w:rFonts w:ascii="Calibri Light" w:hAnsi="Calibri Light" w:cs="Calibri Light"/>
-          <w:sz w:val="28"/>
-          <w:szCs w:val="28"/>
-        </w:rPr>
-        <w:t>Website  -</w:t>
-      </w:r>
-      <w:proofErr w:type="gramEnd"/>
-      <w:r>
-        <w:rPr>
-          <w:rFonts w:ascii="Calibri Light" w:hAnsi="Calibri Light" w:cs="Calibri Light"/>
-          <w:sz w:val="28"/>
-          <w:szCs w:val="28"/>
-        </w:rPr>
-        <w:t xml:space="preserve"> </w:t>
+          <w:b/>
+          <w:bCs/>
+          <w:sz w:val="28"/>
+          <w:szCs w:val="28"/>
+        </w:rPr>
+        <w:t xml:space="preserve">     (b)</w:t>
+      </w:r>
+      <w:r>
+        <w:rPr>
+          <w:b/>
+          <w:bCs/>
+          <w:sz w:val="28"/>
+          <w:szCs w:val="28"/>
+        </w:rPr>
+        <w:t xml:space="preserve">  </w:t>
+      </w:r>
+      <w:r>
+        <w:rPr>
+          <w:sz w:val="28"/>
+          <w:szCs w:val="28"/>
+        </w:rPr>
+        <w:t>“txtUsername” and “txtPassword” using “HTTP” site.</w:t>
+      </w:r>
+    </w:p>
+    <w:p/>
+    <w:p/>
+    <w:p/>
+    <w:p/>
+    <w:p/>
+    <w:p/>
+    <w:p/>
+    <w:p/>
+    <w:p/>
+    <w:p/>
+    <w:p>
+      <w:pPr>
+        <w:pStyle w:val="ListParagraph"/>
+        <w:numPr>
+          <w:ilvl w:val="0"/>
+          <w:numId w:val="14"/>
+        </w:numPr>
+        <w:rPr>
+          <w:b/>
+          <w:bCs/>
+          <w:sz w:val="28"/>
+          <w:szCs w:val="28"/>
+        </w:rPr>
+      </w:pPr>
+      <w:r>
+        <w:rPr>
+          <w:b/>
+          <w:bCs/>
+          <w:sz w:val="28"/>
+          <w:szCs w:val="28"/>
+        </w:rPr>
+        <w:t xml:space="preserve">  </w:t>
+      </w:r>
+      <w:r>
+        <w:rPr>
+          <w:sz w:val="28"/>
+          <w:szCs w:val="28"/>
+        </w:rPr>
+        <w:t>HTTPS / TLS packets after printing unlike the HTTP items as encoded and appear to be random stream of characters via some sort of encoding</w:t>
+      </w:r>
+      <w:r>
+        <w:rPr>
+          <w:sz w:val="28"/>
+          <w:szCs w:val="28"/>
+        </w:rPr>
+        <w:t xml:space="preserve"> (SHA256 most likely)</w:t>
+      </w:r>
+      <w:r>
+        <w:rPr>
+          <w:sz w:val="28"/>
+          <w:szCs w:val="28"/>
+        </w:rPr>
+        <w:t>.</w:t>
       </w:r>
     </w:p>
     <w:sectPr>
-      <w:headerReference w:type="default" r:id="rId25"/>
-      <w:footerReference w:type="default" r:id="rId26"/>
-      <w:footerReference w:type="first" r:id="rId27"/>
+      <w:headerReference w:type="default" r:id="rId24"/>
+      <w:footerReference w:type="default" r:id="rId25"/>
+      <w:footerReference w:type="first" r:id="rId26"/>
       <w:pgSz w:w="11906" w:h="16838"/>
       <w:pgMar w:top="1440" w:right="1440" w:bottom="1440" w:left="1440" w:header="708" w:footer="708" w:gutter="0"/>
       <w:cols w:space="708"/>
@@ -3798,6 +3621,95 @@
     </w:lvl>
   </w:abstractNum>
   <w:abstractNum w:abstractNumId="3" w15:restartNumberingAfterBreak="0">
+    <w:nsid w:val="2A0529FA"/>
+    <w:multiLevelType w:val="hybridMultilevel"/>
+    <w:tmpl w:val="D0BC63AA"/>
+    <w:lvl w:ilvl="0" w:tplc="FFFFFFFF">
+      <w:start w:val="1"/>
+      <w:numFmt w:val="lowerLetter"/>
+      <w:lvlText w:val="(%1)"/>
+      <w:lvlJc w:val="left"/>
+      <w:pPr>
+        <w:ind w:left="720" w:hanging="360"/>
+      </w:pPr>
+      <w:rPr>
+        <w:rFonts w:hint="default"/>
+      </w:rPr>
+    </w:lvl>
+    <w:lvl w:ilvl="1" w:tplc="FFFFFFFF" w:tentative="1">
+      <w:start w:val="1"/>
+      <w:numFmt w:val="lowerLetter"/>
+      <w:lvlText w:val="%2."/>
+      <w:lvlJc w:val="left"/>
+      <w:pPr>
+        <w:ind w:left="1440" w:hanging="360"/>
+      </w:pPr>
+    </w:lvl>
+    <w:lvl w:ilvl="2" w:tplc="FFFFFFFF" w:tentative="1">
+      <w:start w:val="1"/>
+      <w:numFmt w:val="lowerRoman"/>
+      <w:lvlText w:val="%3."/>
+      <w:lvlJc w:val="right"/>
+      <w:pPr>
+        <w:ind w:left="2160" w:hanging="180"/>
+      </w:pPr>
+    </w:lvl>
+    <w:lvl w:ilvl="3" w:tplc="FFFFFFFF" w:tentative="1">
+      <w:start w:val="1"/>
+      <w:numFmt w:val="decimal"/>
+      <w:lvlText w:val="%4."/>
+      <w:lvlJc w:val="left"/>
+      <w:pPr>
+        <w:ind w:left="2880" w:hanging="360"/>
+      </w:pPr>
+    </w:lvl>
+    <w:lvl w:ilvl="4" w:tplc="FFFFFFFF" w:tentative="1">
+      <w:start w:val="1"/>
+      <w:numFmt w:val="lowerLetter"/>
+      <w:lvlText w:val="%5."/>
+      <w:lvlJc w:val="left"/>
+      <w:pPr>
+        <w:ind w:left="3600" w:hanging="360"/>
+      </w:pPr>
+    </w:lvl>
+    <w:lvl w:ilvl="5" w:tplc="FFFFFFFF" w:tentative="1">
+      <w:start w:val="1"/>
+      <w:numFmt w:val="lowerRoman"/>
+      <w:lvlText w:val="%6."/>
+      <w:lvlJc w:val="right"/>
+      <w:pPr>
+        <w:ind w:left="4320" w:hanging="180"/>
+      </w:pPr>
+    </w:lvl>
+    <w:lvl w:ilvl="6" w:tplc="FFFFFFFF" w:tentative="1">
+      <w:start w:val="1"/>
+      <w:numFmt w:val="decimal"/>
+      <w:lvlText w:val="%7."/>
+      <w:lvlJc w:val="left"/>
+      <w:pPr>
+        <w:ind w:left="5040" w:hanging="360"/>
+      </w:pPr>
+    </w:lvl>
+    <w:lvl w:ilvl="7" w:tplc="FFFFFFFF" w:tentative="1">
+      <w:start w:val="1"/>
+      <w:numFmt w:val="lowerLetter"/>
+      <w:lvlText w:val="%8."/>
+      <w:lvlJc w:val="left"/>
+      <w:pPr>
+        <w:ind w:left="5760" w:hanging="360"/>
+      </w:pPr>
+    </w:lvl>
+    <w:lvl w:ilvl="8" w:tplc="FFFFFFFF" w:tentative="1">
+      <w:start w:val="1"/>
+      <w:numFmt w:val="lowerRoman"/>
+      <w:lvlText w:val="%9."/>
+      <w:lvlJc w:val="right"/>
+      <w:pPr>
+        <w:ind w:left="6480" w:hanging="180"/>
+      </w:pPr>
+    </w:lvl>
+  </w:abstractNum>
+  <w:abstractNum w:abstractNumId="4" w15:restartNumberingAfterBreak="0">
     <w:nsid w:val="424E5D2C"/>
     <w:multiLevelType w:val="hybridMultilevel"/>
     <w:tmpl w:val="D0BC63AA"/>
@@ -3886,7 +3798,7 @@
       </w:pPr>
     </w:lvl>
   </w:abstractNum>
-  <w:abstractNum w:abstractNumId="4" w15:restartNumberingAfterBreak="0">
+  <w:abstractNum w:abstractNumId="5" w15:restartNumberingAfterBreak="0">
     <w:nsid w:val="43457448"/>
     <w:multiLevelType w:val="hybridMultilevel"/>
     <w:tmpl w:val="E3B8B1C8"/>
@@ -3975,7 +3887,7 @@
       </w:pPr>
     </w:lvl>
   </w:abstractNum>
-  <w:abstractNum w:abstractNumId="5" w15:restartNumberingAfterBreak="0">
+  <w:abstractNum w:abstractNumId="6" w15:restartNumberingAfterBreak="0">
     <w:nsid w:val="44C4518B"/>
     <w:multiLevelType w:val="hybridMultilevel"/>
     <w:tmpl w:val="D0BC63AA"/>
@@ -4064,7 +3976,7 @@
       </w:pPr>
     </w:lvl>
   </w:abstractNum>
-  <w:abstractNum w:abstractNumId="6" w15:restartNumberingAfterBreak="0">
+  <w:abstractNum w:abstractNumId="7" w15:restartNumberingAfterBreak="0">
     <w:nsid w:val="555C64BE"/>
     <w:multiLevelType w:val="hybridMultilevel"/>
     <w:tmpl w:val="D0BC63AA"/>
@@ -4153,7 +4065,7 @@
       </w:pPr>
     </w:lvl>
   </w:abstractNum>
-  <w:abstractNum w:abstractNumId="7" w15:restartNumberingAfterBreak="0">
+  <w:abstractNum w:abstractNumId="8" w15:restartNumberingAfterBreak="0">
     <w:nsid w:val="57CC6A08"/>
     <w:multiLevelType w:val="hybridMultilevel"/>
     <w:tmpl w:val="E3B8B1C8"/>
@@ -4242,7 +4154,7 @@
       </w:pPr>
     </w:lvl>
   </w:abstractNum>
-  <w:abstractNum w:abstractNumId="8" w15:restartNumberingAfterBreak="0">
+  <w:abstractNum w:abstractNumId="9" w15:restartNumberingAfterBreak="0">
     <w:nsid w:val="5896461A"/>
     <w:multiLevelType w:val="hybridMultilevel"/>
     <w:tmpl w:val="D0BC63AA"/>
@@ -4331,7 +4243,7 @@
       </w:pPr>
     </w:lvl>
   </w:abstractNum>
-  <w:abstractNum w:abstractNumId="9" w15:restartNumberingAfterBreak="0">
+  <w:abstractNum w:abstractNumId="10" w15:restartNumberingAfterBreak="0">
     <w:nsid w:val="5B7A16F2"/>
     <w:multiLevelType w:val="hybridMultilevel"/>
     <w:tmpl w:val="E3B8B1C8"/>
@@ -4420,7 +4332,7 @@
       </w:pPr>
     </w:lvl>
   </w:abstractNum>
-  <w:abstractNum w:abstractNumId="10" w15:restartNumberingAfterBreak="0">
+  <w:abstractNum w:abstractNumId="11" w15:restartNumberingAfterBreak="0">
     <w:nsid w:val="5D100C0D"/>
     <w:multiLevelType w:val="hybridMultilevel"/>
     <w:tmpl w:val="F04E9BB0"/>
@@ -4537,7 +4449,7 @@
       </w:rPr>
     </w:lvl>
   </w:abstractNum>
-  <w:abstractNum w:abstractNumId="11" w15:restartNumberingAfterBreak="0">
+  <w:abstractNum w:abstractNumId="12" w15:restartNumberingAfterBreak="0">
     <w:nsid w:val="616526B6"/>
     <w:multiLevelType w:val="hybridMultilevel"/>
     <w:tmpl w:val="D0BC63AA"/>
@@ -4626,7 +4538,7 @@
       </w:pPr>
     </w:lvl>
   </w:abstractNum>
-  <w:abstractNum w:abstractNumId="12" w15:restartNumberingAfterBreak="0">
+  <w:abstractNum w:abstractNumId="13" w15:restartNumberingAfterBreak="0">
     <w:nsid w:val="6EF33763"/>
     <w:multiLevelType w:val="hybridMultilevel"/>
     <w:tmpl w:val="F4783640"/>
@@ -4717,7 +4629,7 @@
       </w:pPr>
     </w:lvl>
   </w:abstractNum>
-  <w:abstractNum w:abstractNumId="13" w15:restartNumberingAfterBreak="0">
+  <w:abstractNum w:abstractNumId="14" w15:restartNumberingAfterBreak="0">
     <w:nsid w:val="7AD1779A"/>
     <w:multiLevelType w:val="hybridMultilevel"/>
     <w:tmpl w:val="E3B8B1C8"/>
@@ -4810,43 +4722,46 @@
     <w:abstractNumId w:val="1"/>
   </w:num>
   <w:num w:numId="2" w16cid:durableId="504787809">
-    <w:abstractNumId w:val="12"/>
+    <w:abstractNumId w:val="13"/>
   </w:num>
   <w:num w:numId="3" w16cid:durableId="2121216051">
+    <w:abstractNumId w:val="11"/>
+  </w:num>
+  <w:num w:numId="4" w16cid:durableId="1161968187">
+    <w:abstractNumId w:val="7"/>
+  </w:num>
+  <w:num w:numId="5" w16cid:durableId="1850824450">
+    <w:abstractNumId w:val="8"/>
+  </w:num>
+  <w:num w:numId="6" w16cid:durableId="391120912">
+    <w:abstractNumId w:val="14"/>
+  </w:num>
+  <w:num w:numId="7" w16cid:durableId="17201883">
     <w:abstractNumId w:val="10"/>
   </w:num>
-  <w:num w:numId="4" w16cid:durableId="1161968187">
-    <w:abstractNumId w:val="6"/>
+  <w:num w:numId="8" w16cid:durableId="823353456">
+    <w:abstractNumId w:val="5"/>
   </w:num>
-  <w:num w:numId="5" w16cid:durableId="1850824450">
-    <w:abstractNumId w:val="7"/>
-  </w:num>
-  <w:num w:numId="6" w16cid:durableId="391120912">
-    <w:abstractNumId w:val="13"/>
-  </w:num>
-  <w:num w:numId="7" w16cid:durableId="17201883">
+  <w:num w:numId="9" w16cid:durableId="689142807">
     <w:abstractNumId w:val="9"/>
   </w:num>
-  <w:num w:numId="8" w16cid:durableId="823353456">
-    <w:abstractNumId w:val="4"/>
-  </w:num>
-  <w:num w:numId="9" w16cid:durableId="689142807">
-    <w:abstractNumId w:val="8"/>
-  </w:num>
   <w:num w:numId="10" w16cid:durableId="1017931066">
-    <w:abstractNumId w:val="11"/>
+    <w:abstractNumId w:val="12"/>
   </w:num>
   <w:num w:numId="11" w16cid:durableId="519856215">
     <w:abstractNumId w:val="2"/>
   </w:num>
   <w:num w:numId="12" w16cid:durableId="1996451638">
-    <w:abstractNumId w:val="5"/>
+    <w:abstractNumId w:val="6"/>
   </w:num>
   <w:num w:numId="13" w16cid:durableId="1028143126">
-    <w:abstractNumId w:val="3"/>
+    <w:abstractNumId w:val="4"/>
   </w:num>
   <w:num w:numId="14" w16cid:durableId="74474342">
     <w:abstractNumId w:val="0"/>
+  </w:num>
+  <w:num w:numId="15" w16cid:durableId="124087393">
+    <w:abstractNumId w:val="3"/>
   </w:num>
 </w:numbering>
 </file>
@@ -5251,7 +5166,7 @@
   <w:style w:type="paragraph" w:default="1" w:styleId="Normal">
     <w:name w:val="Normal"/>
     <w:qFormat/>
-    <w:rsid w:val="00057C62"/>
+    <w:rsid w:val="009D7904"/>
   </w:style>
   <w:style w:type="paragraph" w:styleId="Heading1">
     <w:name w:val="heading 1"/>
@@ -5455,6 +5370,7 @@
   <w:style w:type="character" w:default="1" w:styleId="DefaultParagraphFont">
     <w:name w:val="Default Paragraph Font"/>
     <w:uiPriority w:val="1"/>
+    <w:semiHidden/>
     <w:unhideWhenUsed/>
   </w:style>
   <w:style w:type="table" w:default="1" w:styleId="TableNormal">

</xml_diff>